<commit_message>
Refuerza auditoría final y trazabilidad del TFM
</commit_message>
<xml_diff>
--- a/memoria/TFM_ENRIQUE_CATRILAF_ENTREGA_FINAL_VIU_2026.docx
+++ b/memoria/TFM_ENRIQUE_CATRILAF_ENTREGA_FINAL_VIU_2026.docx
@@ -414,7 +414,7 @@
           <w:color w:val="000000"/>
           <w:lang w:val="es-ES_tradnl"/>
         </w:rPr>
-        <w:t>La selección de tratamientos oncológicos exige integrar características del paciente, biología tumoral, estadio, biomarcadores, toxicidad prevista y contexto asistencial. Este TFM evalúa la viabilidad de un sistema web de apoyo a la recomendación terapéutica mediante un conjunto público de datos de quimioterapia. El trabajo sigue una adaptación de CRISP-DM e incluye auditoría de procedencia, limpieza semántica, prevención de fuga temporal, comparación de modelos multiclase, análisis no supervisado, evaluación por subgrupos y desarrollo de una interfaz Streamlit. La base limpia contiene 52.321 registros y el subconjunto model-ready 49.765 casos con régimen conocido. Se excluyeron dosis, ciclos, toxicidad, respuesta tumoral y supervivencia por ser posteriores a la decisión. La selección se realizó mediante validación cruzada estratificada repetida de 5 pliegues por 2 repeticiones dentro del conjunto de entrenamiento. Random Forest obtuvo F1 macro medio de 0,2521 y balanced accuracy de 0,2525 en validación; en holdout alcanzó 0,2496 (IC bootstrap 95 %: 0,2420-0,2568) y 0,2499 (0,2422-0,2571), respectivamente. El Dummy estratificado obtuvo F1 macro de 0,2525 en validación. La diferencia pareada de F1 fue -0,0004 (IC 95 %: -0,0064-0,0050; Wilcoxon p=0,9219). Una prueba con 5.000 permutaciones de etiquetas obtuvo p=0,4991; el Brier skill frente a prevalencia fue -0,0118 y la curva de aprendizaje finalizó en F1 de validación=0,2500. Por tanto, no se demuestra señal predictiva útil. La confianza máxima media fue 0,281 y el 100 % del holdout quedó bajo el umbral ilustrativo de abstención de 0,45. El clustering también fue débil, con Silhouette de 0,098 para k=2. La contribución es un resultado negativo reproducible, una auditoría de datos y un prototipo integrado que evita emitir recomendaciones de baja confianza. El sistema no prescribe, no estima dosis y no demuestra reducción de eventos adversos, mejora de resultados ni costo-efectividad.</w:t>
+        <w:t>La selección de tratamientos oncológicos exige integrar características del paciente, biología tumoral, estadio, biomarcadores y contexto asistencial. Este TFM evalúa la viabilidad de un sistema web de apoyo a la recomendación terapéutica mediante un conjunto público de datos de quimioterapia. El trabajo adapta CRISP-DM e incluye auditoría de procedencia, limpieza semántica, prevención de fuga temporal, comparación de modelos multiclase, análisis no supervisado, evaluación por subgrupos e interfaz Streamlit. La base limpia contiene 52.321 registros y el subconjunto model-ready 49.765 casos con régimen conocido. Se excluyeron dosis, ciclos, toxicidad, respuesta tumoral y supervivencia por ser posteriores a la decisión. La selección se realizó mediante validación cruzada estratificada repetida de 5 pliegues por 2 repeticiones dentro de train. Random Forest obtuvo F1 macro medio de 0,2521 y balanced accuracy de 0,2525; en el holdout interno alcanzó 0,2496 (IC bootstrap 95 %: 0,2420-0,2568) y 0,2499 (0,2422-0,2571), respectivamente. El Dummy estratificado obtuvo F1 macro de 0,2525 en validación. La diferencia pareada de F1 fue -0,0004 (IC 95 %: -0,0064-0,0050; Wilcoxon p=0,9219); estos diagnósticos son exploratorios porque los pliegues repetidos no son independientes. Una prueba con 5.000 permutaciones obtuvo p=0,4991; el Brier skill frente a prevalencia fue -0,0118 y la curva de aprendizaje finalizó en F1=0,2500. No se demuestra señal predictiva útil. La confianza máxima media fue 0,281 y el 100 % del holdout quedó bajo el umbral ilustrativo de abstención de 0,45. El clustering también fue débil, con Silhouette de 0,098 para k=2. La contribución es un resultado negativo reproducible, una auditoría de datos y un prototipo que evita emitir recomendaciones de baja confianza. El sistema no prescribe ni demuestra beneficio clínico o costo-efectividad.</w:t>
       </w:r>
     </w:p>
     <w:p>
@@ -1657,7 +1657,7 @@
         </w:rPr>
       </w:pPr>
       <w:r>
-        <w:t>6.6. Evaluación independiente en holdout</w:t>
+        <w:t>6.6. Evaluación interna en holdout</w:t>
       </w:r>
       <w:r>
         <w:tab/>
@@ -4715,7 +4715,7 @@
           <w:color w:val="000000"/>
           <w:lang w:val="es-ES_tradnl"/>
         </w:rPr>
-        <w:t>Comparación multiclase con validación cruzada repetida, holdout independiente, métricas macro, calibración descriptiva y baselines.</w:t>
+        <w:t>Comparación multiclase con validación cruzada repetida, holdout interno, métricas macro, calibración descriptiva y baselines.</w:t>
       </w:r>
     </w:p>
     <w:p>
@@ -9744,7 +9744,7 @@
           <w:color w:val="000000"/>
           <w:lang w:val="es-ES_tradnl"/>
         </w:rPr>
-        <w:t>El paquete utiliza una división estratificada 75/25 con random_state=42. El 75 % se emplea para selección y el 25 % queda como holdout independiente. Dentro de train se aplica RepeatedStratifiedKFold con 5 pliegues y 2 repeticiones. Como el conjunto model-ready no contiene faltantes, las variables categóricas se codifican mediante OneHotEncoder con categorías desconocidas ignoradas y las numéricas se estandarizan sin imputación adicional. Todo el preprocesamiento se encapsula en Pipeline y ColumnTransformer de scikit-learn (Pedregosa et al., 2011) para evitar estimar transformaciones con datos de prueba.</w:t>
+        <w:t>El paquete utiliza una división estratificada 75/25 con random_state=42. El 75 % se emplea para selección y el 25 % queda como holdout interno, separado de esa selección. Dentro de train se aplica RepeatedStratifiedKFold con 5 pliegues y 2 repeticiones. Como el conjunto model-ready no contiene faltantes, las variables categóricas se codifican mediante OneHotEncoder con categorías desconocidas ignoradas y las numéricas se estandarizan sin imputación adicional. Todo el preprocesamiento se encapsula en Pipeline y ColumnTransformer de scikit-learn (Pedregosa et al., 2011) para evitar estimar transformaciones con datos de prueba.</w:t>
       </w:r>
     </w:p>
     <w:p>
@@ -9757,7 +9757,7 @@
         </w:rPr>
       </w:pPr>
       <w:r>
-        <w:t>Se compararon Dummy de mayoría, Dummy estratificado, regresión logística, árbol CART, Random Forest y Extra Trees. El criterio preespecificado fue maximizar el F1 macro mediante validación cruzada entre los modelos no Dummy. Random Forest fue seleccionado y posteriormente reentrenado con todo el conjunto de entrenamiento antes de evaluarse una sola vez en el holdout. El script run_all.py regenera tablas, figuras, modelo y metadatos.</w:t>
+        <w:t>Se compararon Dummy de mayoría, Dummy estratificado, regresión logística, árbol CART, Random Forest y Extra Trees. El criterio preespecificado fue maximizar el F1 macro mediante validación cruzada entre los modelos no Dummy. Random Forest fue seleccionado y reentrenado con todo el conjunto de entrenamiento. El holdout interno, no utilizado para la selección, se empleó posteriormente para comparar los seis modelos y ejecutar auditorías post hoc; por ello no se presenta como validación externa ni como un conjunto consultado una sola vez. El script run_all.py regenera tablas, figuras, modelo y metadatos.</w:t>
       </w:r>
     </w:p>
     <w:p>
@@ -10869,15 +10869,15 @@
     </w:p>
     <w:p>
       <w:r>
-        <w:t>Durante el periodo de trabajo comprendido entre julio y agosto de 2026 se utilizaron herramientas de inteligencia artificial generativa como apoyo metodológico y de programación: ChatGPT (modelo declarado GPT-5.6 Sol), Claude (modelo declarado Claude 4.8) y Gemini (modelo declarado Gemini 3.1 Flash). Su función se restringió a orientar la secuencia de trabajo, contrastar alternativas metodológicas y estadísticas, explicar y depurar código y revisar la coherencia documental. No se utilizaron para crear registros de pacientes, modificar el dataset, ejecutar autónomamente el análisis definitivo, seleccionar tratamientos ni fijar las conclusiones del TFM. Estas prácticas de declaración de propósito, límites y supervisión humana son coherentes con la gobernanza recomendada para modelos multimodales de inteligencia artificial en salud (World Health Organization, 2025).</w:t>
-      </w:r>
-    </w:p>
-    <w:p>
-      <w:r>
-        <w:rPr>
-          <w:color w:val="000000"/>
-        </w:rPr>
-        <w:t>La verificación posterior se realizó sobre los artefactos ejecutables del proyecto: reconstrucción desde el CSV bruto mediante python run_all.py, comprobación de huellas SHA-256, regeneración de tablas y figuras, ejecución de python -m pytest -q y revisión crítica de las salidas. El registro de QA del paquete documenta un entorno Python 3.12.13 y 10 pruebas superadas de 10. Las métricas y conclusiones incluidas en la memoria se obtuvieron de las ejecuciones reproducibles y fueron revisadas por el autor antes de su incorporación.</w:t>
+        <w:t>Durante el periodo de trabajo comprendido entre julio y agosto de 2026 se utilizaron herramientas de inteligencia artificial generativa como apoyo metodológico y de programación: ChatGPT, Claude, Gemini y OpenAI Codex. Las versiones de las tres primeras corresponden a la declaración del autor y no se acreditan mediante logs adjuntos; en Codex solo se identifica la familia GPT-5, sin atribuir un identificador interno no disponible. La asistencia incluyó contraste metodológico, explicación y depuración de Python, diseño de pruebas, revisión documental y auditoría final del repositorio. Las herramientas no crearon pacientes ni modificaron las etiquetas; los cálculos definitivos proceden del pipeline ejecutable. La responsabilidad de revisar, comprender y defender cada decisión corresponde al autor (World Health Organization, 2025).</w:t>
+      </w:r>
+    </w:p>
+    <w:p>
+      <w:r>
+        <w:rPr>
+          <w:color w:val="000000"/>
+        </w:rPr>
+        <w:t>La verificación posterior se realizó sobre los artefactos ejecutables del proyecto: reconstrucción desde el CSV bruto mediante python run_all.py, comprobación de huellas SHA-256, regeneración de tablas y figuras, ejecución de python -m pytest -q y revisión crítica de las salidas. El registro de QA documenta Python 3.12.13 y 13 pruebas superadas de 13. Las cifras incluidas en la memoria proceden de las ejecuciones reproducibles. Antes del depósito, el autor debe confirmar que comprende las decisiones y que el registro de herramientas coincide con el uso real.</w:t>
       </w:r>
     </w:p>
     <w:p>
@@ -10940,6 +10940,8 @@
       <w:tr>
         <w:trPr>
           <w:jc w:val="center"/>
+          <w:tblHeader/>
+          <w:cantSplit/>
         </w:trPr>
         <w:tc>
           <w:tcPr>
@@ -10947,13 +10949,9 @@
             <w:vAlign w:val="center"/>
           </w:tcPr>
           <w:p>
-            <w:pPr>
-              <w:spacing w:after="0"/>
-              <w:jc w:val="center"/>
-            </w:pPr>
-            <w:r>
-              <w:rPr>
-                <w:b/>
+            <w:r>
+              <w:rPr>
+                <w:sz w:val="15"/>
               </w:rPr>
               <w:t>Herramienta</w:t>
             </w:r>
@@ -10965,13 +10963,9 @@
             <w:vAlign w:val="center"/>
           </w:tcPr>
           <w:p>
-            <w:pPr>
-              <w:spacing w:after="0"/>
-              <w:jc w:val="center"/>
-            </w:pPr>
-            <w:r>
-              <w:rPr>
-                <w:b/>
+            <w:r>
+              <w:rPr>
+                <w:sz w:val="15"/>
               </w:rPr>
               <w:t>Modelo</w:t>
             </w:r>
@@ -10983,13 +10977,9 @@
             <w:vAlign w:val="center"/>
           </w:tcPr>
           <w:p>
-            <w:pPr>
-              <w:spacing w:after="0"/>
-              <w:jc w:val="center"/>
-            </w:pPr>
-            <w:r>
-              <w:rPr>
-                <w:b/>
+            <w:r>
+              <w:rPr>
+                <w:sz w:val="15"/>
               </w:rPr>
               <w:t>Rango</w:t>
             </w:r>
@@ -11001,13 +10991,9 @@
             <w:vAlign w:val="center"/>
           </w:tcPr>
           <w:p>
-            <w:pPr>
-              <w:spacing w:after="0"/>
-              <w:jc w:val="center"/>
-            </w:pPr>
-            <w:r>
-              <w:rPr>
-                <w:b/>
+            <w:r>
+              <w:rPr>
+                <w:sz w:val="15"/>
               </w:rPr>
               <w:t>Finalidad</w:t>
             </w:r>
@@ -11019,13 +11005,9 @@
             <w:vAlign w:val="center"/>
           </w:tcPr>
           <w:p>
-            <w:pPr>
-              <w:spacing w:after="0"/>
-              <w:jc w:val="center"/>
-            </w:pPr>
-            <w:r>
-              <w:rPr>
-                <w:b/>
+            <w:r>
+              <w:rPr>
+                <w:sz w:val="15"/>
               </w:rPr>
               <w:t>Verificación</w:t>
             </w:r>
@@ -11035,6 +11017,7 @@
       <w:tr>
         <w:trPr>
           <w:jc w:val="center"/>
+          <w:cantSplit/>
         </w:trPr>
         <w:tc>
           <w:tcPr>
@@ -11042,11 +11025,10 @@
             <w:vAlign w:val="center"/>
           </w:tcPr>
           <w:p>
-            <w:pPr>
-              <w:spacing w:after="0"/>
-              <w:jc w:val="left"/>
-            </w:pPr>
-            <w:r>
+            <w:r>
+              <w:rPr>
+                <w:sz w:val="15"/>
+              </w:rPr>
               <w:t>ChatGPT</w:t>
             </w:r>
           </w:p>
@@ -11057,12 +11039,11 @@
             <w:vAlign w:val="center"/>
           </w:tcPr>
           <w:p>
-            <w:pPr>
-              <w:spacing w:after="0"/>
-              <w:jc w:val="left"/>
-            </w:pPr>
-            <w:r>
-              <w:t>GPT-5.6 Sol</w:t>
+            <w:r>
+              <w:rPr>
+                <w:sz w:val="15"/>
+              </w:rPr>
+              <w:t>GPT-5.6 Sol*</w:t>
             </w:r>
           </w:p>
         </w:tc>
@@ -11072,12 +11053,11 @@
             <w:vAlign w:val="center"/>
           </w:tcPr>
           <w:p>
-            <w:pPr>
-              <w:spacing w:after="0"/>
-              <w:jc w:val="left"/>
-            </w:pPr>
-            <w:r>
-              <w:t>jul–ago 2026</w:t>
+            <w:r>
+              <w:rPr>
+                <w:sz w:val="15"/>
+              </w:rPr>
+              <w:t>jul-ago 2026</w:t>
             </w:r>
           </w:p>
         </w:tc>
@@ -11087,12 +11067,11 @@
             <w:vAlign w:val="center"/>
           </w:tcPr>
           <w:p>
-            <w:pPr>
-              <w:spacing w:after="0"/>
-              <w:jc w:val="left"/>
-            </w:pPr>
-            <w:r>
-              <w:t>Metodología, estadística, depuración de código y coherencia.</w:t>
+            <w:r>
+              <w:rPr>
+                <w:sz w:val="15"/>
+              </w:rPr>
+              <w:t>Metodología, estadística, código y documentación.</w:t>
             </w:r>
           </w:p>
         </w:tc>
@@ -11102,12 +11081,11 @@
             <w:vAlign w:val="center"/>
           </w:tcPr>
           <w:p>
-            <w:pPr>
-              <w:spacing w:after="0"/>
-              <w:jc w:val="left"/>
-            </w:pPr>
-            <w:r>
-              <w:t>run_all.py, hashes, outputs, pytest y revisión del autor.</w:t>
+            <w:r>
+              <w:rPr>
+                <w:sz w:val="15"/>
+              </w:rPr>
+              <w:t>Pipeline, hashes, outputs y pytest.</w:t>
             </w:r>
           </w:p>
         </w:tc>
@@ -11115,6 +11093,7 @@
       <w:tr>
         <w:trPr>
           <w:jc w:val="center"/>
+          <w:cantSplit/>
         </w:trPr>
         <w:tc>
           <w:tcPr>
@@ -11122,11 +11101,10 @@
             <w:vAlign w:val="center"/>
           </w:tcPr>
           <w:p>
-            <w:pPr>
-              <w:spacing w:after="0"/>
-              <w:jc w:val="left"/>
-            </w:pPr>
-            <w:r>
+            <w:r>
+              <w:rPr>
+                <w:sz w:val="15"/>
+              </w:rPr>
               <w:t>Claude</w:t>
             </w:r>
           </w:p>
@@ -11137,12 +11115,11 @@
             <w:vAlign w:val="center"/>
           </w:tcPr>
           <w:p>
-            <w:pPr>
-              <w:spacing w:after="0"/>
-              <w:jc w:val="left"/>
-            </w:pPr>
-            <w:r>
-              <w:t>Claude 4.8</w:t>
+            <w:r>
+              <w:rPr>
+                <w:sz w:val="15"/>
+              </w:rPr>
+              <w:t>Claude 4.8*</w:t>
             </w:r>
           </w:p>
         </w:tc>
@@ -11152,12 +11129,11 @@
             <w:vAlign w:val="center"/>
           </w:tcPr>
           <w:p>
-            <w:pPr>
-              <w:spacing w:after="0"/>
-              <w:jc w:val="left"/>
-            </w:pPr>
-            <w:r>
-              <w:t>jul–ago 2026</w:t>
+            <w:r>
+              <w:rPr>
+                <w:sz w:val="15"/>
+              </w:rPr>
+              <w:t>jul-ago 2026</w:t>
             </w:r>
           </w:p>
         </w:tc>
@@ -11167,16 +11143,11 @@
             <w:vAlign w:val="center"/>
           </w:tcPr>
           <w:p>
-            <w:pPr>
-              <w:spacing w:after="0"/>
-              <w:jc w:val="left"/>
-            </w:pPr>
-            <w:r>
-              <w:t xml:space="preserve">Contraste metodológico; apoyo </w:t>
-            </w:r>
-            <w:r>
-              <w:lastRenderedPageBreak/>
-              <w:t>en código y documentación.</w:t>
+            <w:r>
+              <w:rPr>
+                <w:sz w:val="15"/>
+              </w:rPr>
+              <w:t>Contraste metodológico; apoyo en código y texto.</w:t>
             </w:r>
           </w:p>
         </w:tc>
@@ -11186,13 +11157,11 @@
             <w:vAlign w:val="center"/>
           </w:tcPr>
           <w:p>
-            <w:pPr>
-              <w:spacing w:after="0"/>
-              <w:jc w:val="left"/>
-            </w:pPr>
-            <w:r>
-              <w:lastRenderedPageBreak/>
-              <w:t>Pipeline, outputs, pruebas y revisión del autor.</w:t>
+            <w:r>
+              <w:rPr>
+                <w:sz w:val="15"/>
+              </w:rPr>
+              <w:t>Pipeline, outputs y revisión del autor.</w:t>
             </w:r>
           </w:p>
         </w:tc>
@@ -11200,6 +11169,7 @@
       <w:tr>
         <w:trPr>
           <w:jc w:val="center"/>
+          <w:cantSplit/>
         </w:trPr>
         <w:tc>
           <w:tcPr>
@@ -11207,11 +11177,10 @@
             <w:vAlign w:val="center"/>
           </w:tcPr>
           <w:p>
-            <w:pPr>
-              <w:spacing w:after="0"/>
-              <w:jc w:val="left"/>
-            </w:pPr>
-            <w:r>
+            <w:r>
+              <w:rPr>
+                <w:sz w:val="15"/>
+              </w:rPr>
               <w:t>Gemini</w:t>
             </w:r>
           </w:p>
@@ -11222,12 +11191,11 @@
             <w:vAlign w:val="center"/>
           </w:tcPr>
           <w:p>
-            <w:pPr>
-              <w:spacing w:after="0"/>
-              <w:jc w:val="left"/>
-            </w:pPr>
-            <w:r>
-              <w:t>Gemini 3.1 Flash</w:t>
+            <w:r>
+              <w:rPr>
+                <w:sz w:val="15"/>
+              </w:rPr>
+              <w:t>Gemini 3.1 Flash*</w:t>
             </w:r>
           </w:p>
         </w:tc>
@@ -11237,12 +11205,11 @@
             <w:vAlign w:val="center"/>
           </w:tcPr>
           <w:p>
-            <w:pPr>
-              <w:spacing w:after="0"/>
-              <w:jc w:val="left"/>
-            </w:pPr>
-            <w:r>
-              <w:t>jul–ago 2026</w:t>
+            <w:r>
+              <w:rPr>
+                <w:sz w:val="15"/>
+              </w:rPr>
+              <w:t>jul-ago 2026</w:t>
             </w:r>
           </w:p>
         </w:tc>
@@ -11252,12 +11219,11 @@
             <w:vAlign w:val="center"/>
           </w:tcPr>
           <w:p>
-            <w:pPr>
-              <w:spacing w:after="0"/>
-              <w:jc w:val="left"/>
-            </w:pPr>
-            <w:r>
-              <w:t>Contraste de enfoques; documentación y programación.</w:t>
+            <w:r>
+              <w:rPr>
+                <w:sz w:val="15"/>
+              </w:rPr>
+              <w:t>Contraste de enfoques; programación y documentación.</w:t>
             </w:r>
           </w:p>
         </w:tc>
@@ -11267,12 +11233,81 @@
             <w:vAlign w:val="center"/>
           </w:tcPr>
           <w:p>
-            <w:pPr>
-              <w:spacing w:after="0"/>
-              <w:jc w:val="left"/>
-            </w:pPr>
-            <w:r>
-              <w:t>Código, resultados ejecutados y revisión del autor.</w:t>
+            <w:r>
+              <w:rPr>
+                <w:sz w:val="15"/>
+              </w:rPr>
+              <w:t>Código y resultados reproducibles.</w:t>
+            </w:r>
+          </w:p>
+        </w:tc>
+      </w:tr>
+      <w:tr>
+        <w:trPr>
+          <w:cantSplit/>
+        </w:trPr>
+        <w:tc>
+          <w:tcPr>
+            <w:tcW w:type="dxa" w:w="1296"/>
+          </w:tcPr>
+          <w:p>
+            <w:r>
+              <w:rPr>
+                <w:sz w:val="15"/>
+              </w:rPr>
+              <w:t>OpenAI Codex</w:t>
+            </w:r>
+          </w:p>
+        </w:tc>
+        <w:tc>
+          <w:tcPr>
+            <w:tcW w:type="dxa" w:w="1512"/>
+          </w:tcPr>
+          <w:p>
+            <w:r>
+              <w:rPr>
+                <w:sz w:val="15"/>
+              </w:rPr>
+              <w:t>Familia GPT-5**</w:t>
+            </w:r>
+          </w:p>
+        </w:tc>
+        <w:tc>
+          <w:tcPr>
+            <w:tcW w:type="dxa" w:w="1296"/>
+          </w:tcPr>
+          <w:p>
+            <w:r>
+              <w:rPr>
+                <w:sz w:val="15"/>
+              </w:rPr>
+              <w:t>jul-ago 2026</w:t>
+            </w:r>
+          </w:p>
+        </w:tc>
+        <w:tc>
+          <w:tcPr>
+            <w:tcW w:type="dxa" w:w="2520"/>
+          </w:tcPr>
+          <w:p>
+            <w:r>
+              <w:rPr>
+                <w:sz w:val="15"/>
+              </w:rPr>
+              <w:t>Auditoría, depuración, pruebas y coherencia del repositorio.</w:t>
+            </w:r>
+          </w:p>
+        </w:tc>
+        <w:tc>
+          <w:tcPr>
+            <w:tcW w:type="dxa" w:w="2664"/>
+          </w:tcPr>
+          <w:p>
+            <w:r>
+              <w:rPr>
+                <w:sz w:val="15"/>
+              </w:rPr>
+              <w:t>Pipeline, pytest, hashes y revisión funcional.</w:t>
             </w:r>
           </w:p>
         </w:tc>
@@ -11301,10 +11336,7 @@
     </w:p>
     <w:p>
       <w:r>
-        <w:rPr>
-          <w:color w:val="000000"/>
-        </w:rPr>
-        <w:t>Nota. Los nombres de modelo corresponden a las versiones declaradas durante el proceso de trabajo. La asistencia generativa se documenta por transparencia académica y no sustituye la ejecución, validación ni interpretación del análisis.</w:t>
+        <w:t>Nota. Los nombres de modelo corresponden a las versiones declaradas durante el proceso de trabajo y no acreditadas mediante logs adjuntos. En Codex solo se consigna la familia observable, sin atribuir un identificador interno. La asistencia se documenta por transparencia académica y no sustituye la comprensión, verificación ni defensa del autor.</w:t>
       </w:r>
     </w:p>
     <w:p>
@@ -12053,7 +12085,7 @@
                 <w:color w:val="000000"/>
                 <w:lang w:val="es-ES_tradnl"/>
               </w:rPr>
-              <w:t>CV repetida y holdout independiente</w:t>
+              <w:t>CV repetida y holdout interno</w:t>
             </w:r>
           </w:p>
         </w:tc>
@@ -16708,7 +16740,7 @@
           <wp:inline distT="0" distB="0" distL="0" distR="0" wp14:anchorId="3C0FC36C" wp14:editId="254E1CC9">
             <wp:extent cx="5230368" cy="3433985"/>
             <wp:effectExtent l="0" t="0" r="0" b="1270"/>
-            <wp:docPr id="1166336383" name="Imagen 1"/>
+            <wp:docPr id="1166336383" name="Imagen 1" descr="Asociaciones entre predictores y régimen de quimioterapia." title="Asociaciones entre predictores y régimen de quimioterapia."/>
             <wp:cNvGraphicFramePr>
               <a:graphicFrameLocks xmlns:a="http://schemas.openxmlformats.org/drawingml/2006/main" noChangeAspect="1"/>
             </wp:cNvGraphicFramePr>
@@ -18160,7 +18192,7 @@
           <wp:inline distT="0" distB="0" distL="0" distR="0" wp14:anchorId="79089853" wp14:editId="5DAF2AD3">
             <wp:extent cx="5230368" cy="3277282"/>
             <wp:effectExtent l="0" t="0" r="0" b="2540"/>
-            <wp:docPr id="1607808954" name="Imagen 1"/>
+            <wp:docPr id="1607808954" name="Imagen 1" descr="Comparación de F1 macro en validación cruzada repetida." title="Comparación de F1 macro en validación cruzada repetida."/>
             <wp:cNvGraphicFramePr>
               <a:graphicFrameLocks xmlns:a="http://schemas.openxmlformats.org/drawingml/2006/main" noChangeAspect="1"/>
             </wp:cNvGraphicFramePr>
@@ -18248,7 +18280,7 @@
           <w:szCs w:val="22"/>
           <w:lang w:val="es-ES_tradnl"/>
         </w:rPr>
-        <w:t>6.6. Evaluación independiente en holdout</w:t>
+        <w:t>6.6. Evaluación interna en holdout</w:t>
       </w:r>
     </w:p>
     <w:p>
@@ -19845,7 +19877,7 @@
           <wp:inline distT="0" distB="0" distL="0" distR="0" wp14:anchorId="29E962A9" wp14:editId="6EE0F79F">
             <wp:extent cx="5230368" cy="3291292"/>
             <wp:effectExtent l="0" t="0" r="0" b="0"/>
-            <wp:docPr id="988381704" name="Imagen 1"/>
+            <wp:docPr id="988381704" name="Imagen 1" descr="F1 macro por sexo y grupo de edad." title="F1 macro por sexo y grupo de edad."/>
             <wp:cNvGraphicFramePr>
               <a:graphicFrameLocks xmlns:a="http://schemas.openxmlformats.org/drawingml/2006/main" noChangeAspect="1"/>
             </wp:cNvGraphicFramePr>
@@ -20482,29 +20514,7 @@
           <w:color w:val="000000"/>
           <w:lang w:val="es-ES_tradnl"/>
         </w:rPr>
-        <w:t>El bootstrap estratificado del holdout (500 réplicas) situó el IC del 95 % del F1 macro entre 0,2420 y 0,2568, y el de balanced accuracy entre 0,2422 y 0,2571. En los diez pliegues pareados, la diferencia media de F1 entre Random Forest y Dummy estratificado fue -0,0004, con IC bootstrap del 95 % entre -0,0064 y 0,0050 y prueba de Wilcoxon p=0,9219. El intervalo cruza cero ampliamente y la prueba no aporta evidencia de superioridad</w:t>
-      </w:r>
-      <w:r>
-        <w:rPr>
-          <w:rFonts w:asciiTheme="majorHAnsi" w:hAnsiTheme="majorHAnsi" w:cstheme="majorHAnsi"/>
-          <w:color w:val="000000"/>
-          <w:lang w:val="es-ES_tradnl"/>
-        </w:rPr>
-        <w:t xml:space="preserve"> </w:t>
-      </w:r>
-      <w:r>
-        <w:rPr>
-          <w:color w:val="000000"/>
-        </w:rPr>
-        <w:t>(Van Calster et al., 2019)</w:t>
-      </w:r>
-      <w:r>
-        <w:rPr>
-          <w:rFonts w:asciiTheme="majorHAnsi" w:hAnsiTheme="majorHAnsi" w:cstheme="majorHAnsi"/>
-          <w:color w:val="000000"/>
-          <w:lang w:val="es-ES_tradnl"/>
-        </w:rPr>
-        <w:t>.</w:t>
+        <w:t>El bootstrap estratificado del holdout (500 réplicas) situó el IC del 95 % del F1 macro entre 0,2420 y 0,2568, y el de balanced accuracy entre 0,2422 y 0,2571. En los diez resultados pareados de la CV, la diferencia media de F1 entre Random Forest y Dummy estratificado fue -0,0004, con IC bootstrap del 95 % entre -0,0064 y 0,0050 y Wilcoxon p=0,9219. El intervalo cruza cero y no aporta evidencia de superioridad. Esta inferencia es exploratoria: los pliegues de la CV repetida se solapan y no constituyen observaciones independientes (Van Calster et al., 2019).</w:t>
       </w:r>
     </w:p>
     <w:p>
@@ -21799,7 +21809,7 @@
           <w:color w:val="000000"/>
           <w:lang w:val="es-ES_tradnl"/>
         </w:rPr>
-        <w:t>La conclusión de señal insuficiente se apoya en evidencias convergentes: validación cruzada repetida equivalente al Dummy, diferencia pareada con intervalo que cruza cero y Wilcoxon p=0,9219, holdout independiente con balanced accuracy de 0,2499, prueba de aleatorización p=0,4991, Brier skill negativo, curva de aprendizaje plana, MCC prácticamente nulo, matriz sin diagonal dominante, importancias por permutación no estables, asociaciones cercanas a cero y clustering débil. La coincidencia entre métodos supervisados, inferencia estadística y exploración no supervisada hace más sólido el resultado negativo que una única comparación algorítmica.</w:t>
+        <w:t>La conclusión de señal insuficiente se apoya en evidencias convergentes: validación cruzada repetida equivalente al Dummy; comparación pareada exploratoria con intervalo que cruza cero; holdout interno con balanced accuracy de 0,2499; prueba de aleatorización p=0,4991; Brier skill negativo; curva de aprendizaje plana; MCC prácticamente nulo; matriz sin diagonal dominante; importancias por permutación no estables; asociaciones cercanas a cero y clustering débil. La coincidencia entre métodos supervisados, auditorías estadísticas y exploración no supervisada hace más sólido el resultado negativo que una única comparación algorítmica.</w:t>
       </w:r>
     </w:p>
     <w:p>
@@ -36932,7 +36942,7 @@
         <w:rPr>
           <w:color w:val="000000"/>
         </w:rPr>
-        <w:t>ChatGPT — modelo declarado GPT-5.6 Sol. Finalidad: ordenar etapas CRISP-DM, revisar alternativas estadísticas, explicar procedimientos y apoyar depuración de Python y documentación técnica. Verificación: contraste con run_all.py, outputs/tables, outputs/figures, hashes del manifiesto y pruebas automatizadas antes de incorporar resultados.</w:t>
+        <w:t>ChatGPT — versión declarada por el autor: GPT-5.6 Sol; no acreditada mediante log adjunto. Finalidad: ordenar etapas CRISP-DM, revisar alternativas estadísticas, explicar procedimientos y apoyar depuración de Python y documentación. Verificación: run_all.py, outputs, hashes y pruebas.</w:t>
       </w:r>
     </w:p>
     <w:p>
@@ -36943,7 +36953,7 @@
         <w:rPr>
           <w:color w:val="000000"/>
         </w:rPr>
-        <w:t>Claude — modelo declarado Claude 4.8. Finalidad: contraste metodológico, revisión de coherencia de procedimientos y apoyo en explicación/depuración de código. Verificación: ejecución local del pipeline, comparación con métricas regeneradas y revisión crítica del autor.</w:t>
+        <w:t>Claude — versión declarada por el autor: Claude 4.8; no acreditada mediante log adjunto. Finalidad: contraste metodológico y apoyo en explicación, depuración y documentación. Verificación: ejecución del pipeline y comparación con las métricas regeneradas.</w:t>
       </w:r>
     </w:p>
     <w:p>
@@ -36954,7 +36964,7 @@
         <w:rPr>
           <w:color w:val="000000"/>
         </w:rPr>
-        <w:t>Gemini — modelo declarado Gemini 3.1 Flash. Finalidad: contraste de enfoques y apoyo en documentación y procedimientos de programación. Verificación: comparación con código ejecutado y resultados reproducibles, sin aceptar salidas que modificaran datos, etiquetas o conclusiones.</w:t>
+        <w:t>Gemini — versión declarada por el autor: Gemini 3.1 Flash; no acreditada mediante log adjunto. Finalidad: contraste de enfoques y apoyo en documentación y programación. Verificación: comparación con el código ejecutado y los resultados reproducibles.</w:t>
       </w:r>
     </w:p>
     <w:p>
@@ -36962,10 +36972,18 @@
         <w:spacing w:after="60"/>
       </w:pPr>
       <w:r>
-        <w:rPr>
-          <w:color w:val="000000"/>
-        </w:rPr>
-        <w:t>Control de integridad. El archivo bruto se verifica mediante SHA-256 antes del entrenamiento; run_all.py reconstruye datasets derivados y ejecuta el análisis. El informe QA del paquete registra Python 3.12.13, 10/10 pruebas superadas y consistencia de las cifras principales. Ninguna herramienta generativa creó datos clínicos, modificó el dataset, seleccionó tratamientos, fijó el umbral como criterio clínico ni sustituyó la interpretación del autor.</w:t>
+        <w:t>OpenAI Codex — aplicación de escritorio, familia GPT-5; identificador interno no disponible. Finalidad: revisión del código, apoyo en depuración, pruebas, coherencia documental, auditoría y preparación del repositorio. Verificación: pipeline completo, pytest, comprobación de hashes y revisión funcional local y pública.</w:t>
+      </w:r>
+    </w:p>
+    <w:p>
+      <w:pPr>
+        <w:spacing w:after="60"/>
+      </w:pPr>
+      <w:r>
+        <w:rPr>
+          <w:color w:val="000000"/>
+        </w:rPr>
+        <w:t>Control de integridad. El archivo bruto se verifica mediante SHA-256 antes del entrenamiento; run_all.py reconstruye los datasets derivados y ejecuta el análisis. El informe QA registra Python 3.12.13, 13/13 pruebas superadas y consistencia de las cifras principales. Ninguna herramienta generativa creó datos clínicos, modificó etiquetas, seleccionó tratamientos o fijó el umbral como criterio clínico. El autor conserva la responsabilidad de comprender y defender el trabajo.</w:t>
       </w:r>
     </w:p>
     <w:p>
@@ -37781,7 +37799,7 @@
           <w:b/>
           <w:color w:val="000000"/>
         </w:rPr>
-        <w:t>Hito 4. Holdout independiente y transformaciones dentro del Pipeline</w:t>
+        <w:t>Hito 4. Holdout interno y transformaciones dentro del Pipeline</w:t>
       </w:r>
     </w:p>
     <w:p>
@@ -38395,140 +38413,29 @@
           </w:tcPr>
           <w:p>
             <w:pPr>
-              <w:spacing w:after="0" w:line="240" w:lineRule="auto"/>
-              <w:jc w:val="left"/>
-            </w:pPr>
-            <w:r>
-              <w:rPr>
-                <w:rFonts w:ascii="Courier New" w:eastAsia="Courier New" w:hAnsi="Courier New"/>
-                <w:color w:val="000000"/>
-                <w:sz w:val="16"/>
-              </w:rPr>
-              <w:t>randomization, null_distribution = holdout_label_randomization_test(</w:t>
-            </w:r>
-            <w:r>
-              <w:rPr>
-                <w:rFonts w:ascii="Courier New" w:eastAsia="Courier New" w:hAnsi="Courier New"/>
-                <w:color w:val="000000"/>
-                <w:sz w:val="16"/>
-              </w:rPr>
+              <w:jc w:val="left"/>
+            </w:pPr>
+            <w:r>
+              <w:rPr>
+                <w:rFonts w:ascii="Consolas" w:hAnsi="Consolas"/>
+                <w:sz w:val="15"/>
+              </w:rPr>
+              <w:t>signal_gate = {</w:t>
               <w:br/>
-              <w:t xml:space="preserve">    y_test, predictions, n_permutations=5000</w:t>
-            </w:r>
-            <w:r>
-              <w:rPr>
-                <w:rFonts w:ascii="Courier New" w:eastAsia="Courier New" w:hAnsi="Courier New"/>
-                <w:color w:val="000000"/>
-                <w:sz w:val="16"/>
-              </w:rPr>
+              <w:t xml:space="preserve">    "delta_f1_vs_dummy_ge_0_01": delta_f1 &gt;= 0.01,</w:t>
               <w:br/>
-              <w:t>)</w:t>
-            </w:r>
-            <w:r>
-              <w:rPr>
-                <w:rFonts w:ascii="Courier New" w:eastAsia="Courier New" w:hAnsi="Courier New"/>
-                <w:color w:val="000000"/>
-                <w:sz w:val="16"/>
-              </w:rPr>
+              <w:t xml:space="preserve">    "randomization_p_lt_0_05": p_perm &lt; 0.05,</w:t>
               <w:br/>
-            </w:r>
-            <w:r>
-              <w:rPr>
-                <w:rFonts w:ascii="Courier New" w:eastAsia="Courier New" w:hAnsi="Courier New"/>
-                <w:color w:val="000000"/>
-                <w:sz w:val="16"/>
-              </w:rPr>
+              <w:t xml:space="preserve">    "positive_brier_skill": brier_skill &gt; 0,</w:t>
               <w:br/>
-              <w:t>delta_f1 = float(cv_selected["f1_macro_mean"] - dummy_stratified)</w:t>
-            </w:r>
-            <w:r>
-              <w:rPr>
-                <w:rFonts w:ascii="Courier New" w:eastAsia="Courier New" w:hAnsi="Courier New"/>
-                <w:color w:val="000000"/>
-                <w:sz w:val="16"/>
-              </w:rPr>
+              <w:t xml:space="preserve">    "nonzero_coverage_at_safety_threshold": abstention_rate &lt; 1.0,</w:t>
               <w:br/>
-              <w:t>abstention_threshold = 0.45</w:t>
-            </w:r>
-            <w:r>
-              <w:rPr>
-                <w:rFonts w:ascii="Courier New" w:eastAsia="Courier New" w:hAnsi="Courier New"/>
-                <w:color w:val="000000"/>
-                <w:sz w:val="16"/>
-              </w:rPr>
+              <w:t>}</w:t>
               <w:br/>
-              <w:t>abstention_rate = float(</w:t>
-            </w:r>
-            <w:r>
-              <w:rPr>
-                <w:rFonts w:ascii="Courier New" w:eastAsia="Courier New" w:hAnsi="Courier New"/>
-                <w:color w:val="000000"/>
-                <w:sz w:val="16"/>
-              </w:rPr>
               <w:br/>
-              <w:t xml:space="preserve">    (predictions_df["confianza_maxima"] &lt; abstention_threshold).mean()</w:t>
-            </w:r>
-            <w:r>
-              <w:rPr>
-                <w:rFonts w:ascii="Courier New" w:eastAsia="Courier New" w:hAnsi="Courier New"/>
-                <w:color w:val="000000"/>
-                <w:sz w:val="16"/>
-              </w:rPr>
+              <w:t>signal_gate_passed = all(signal_gate.values())</w:t>
               <w:br/>
-              <w:t>)</w:t>
-            </w:r>
-            <w:r>
-              <w:rPr>
-                <w:rFonts w:ascii="Courier New" w:eastAsia="Courier New" w:hAnsi="Courier New"/>
-                <w:color w:val="000000"/>
-                <w:sz w:val="16"/>
-              </w:rPr>
-              <w:br/>
-            </w:r>
-            <w:r>
-              <w:rPr>
-                <w:rFonts w:ascii="Courier New" w:eastAsia="Courier New" w:hAnsi="Courier New"/>
-                <w:color w:val="000000"/>
-                <w:sz w:val="16"/>
-              </w:rPr>
-              <w:br/>
-              <w:t>if delta_f1 &lt; 0.01:</w:t>
-            </w:r>
-            <w:r>
-              <w:rPr>
-                <w:rFonts w:ascii="Courier New" w:eastAsia="Courier New" w:hAnsi="Courier New"/>
-                <w:color w:val="000000"/>
-                <w:sz w:val="16"/>
-              </w:rPr>
-              <w:br/>
-              <w:t xml:space="preserve">    evidence_conclusion = (</w:t>
-            </w:r>
-            <w:r>
-              <w:rPr>
-                <w:rFonts w:ascii="Courier New" w:eastAsia="Courier New" w:hAnsi="Courier New"/>
-                <w:color w:val="000000"/>
-                <w:sz w:val="16"/>
-              </w:rPr>
-              <w:br/>
-              <w:t xml:space="preserve">        "No se demuestra señal predictiva útil: F1 macro y balanced accuracy "</w:t>
-            </w:r>
-            <w:r>
-              <w:rPr>
-                <w:rFonts w:ascii="Courier New" w:eastAsia="Courier New" w:hAnsi="Courier New"/>
-                <w:color w:val="000000"/>
-                <w:sz w:val="16"/>
-              </w:rPr>
-              <w:br/>
-              <w:t xml:space="preserve">        "son equivalentes al azar."</w:t>
-            </w:r>
-            <w:r>
-              <w:rPr>
-                <w:rFonts w:ascii="Courier New" w:eastAsia="Courier New" w:hAnsi="Courier New"/>
-                <w:color w:val="000000"/>
-                <w:sz w:val="16"/>
-              </w:rPr>
-              <w:br/>
-              <w:t xml:space="preserve">    )</w:t>
+              <w:t>clinical_go = False  # requiere validación externa y prospectiva</w:t>
             </w:r>
           </w:p>
         </w:tc>

</xml_diff>

<commit_message>
Cierra acta y enlaza anexos A-L
</commit_message>
<xml_diff>
--- a/memoria/TFM_ENRIQUE_CATRILAF_ENTREGA_FINAL_VIU_2026.docx
+++ b/memoria/TFM_ENRIQUE_CATRILAF_ENTREGA_FINAL_VIU_2026.docx
@@ -1841,7 +1841,7 @@
         </w:rPr>
       </w:pPr>
       <w:r>
-        <w:t>6.14. Prueba de aleatorización, curva de aprendizaje y skill</w:t>
+        <w:t>6.14. Diagnóstico del proceso generador de datos</w:t>
       </w:r>
       <w:r>
         <w:tab/>
@@ -21010,12 +21010,12 @@
           <w:szCs w:val="22"/>
           <w:lang w:val="es-ES_tradnl"/>
         </w:rPr>
-        <w:t>6.14. Prueba de aleatorización, curva de aprendizaje y skill</w:t>
-      </w:r>
-    </w:p>
-    <w:p>
-      <w:r>
-        <w:t>Para comprobar si el rendimiento obtenido por el modelo era realmente superior al azar, se realizó una prueba de aleatorización sobre el conjunto holdout. Las predicciones generadas por el pipeline se mantuvieron fijas y las etiquetas reales de los regímenes de quimioterapia se mezclaron aleatoriamente 5.000 veces. En cada repetición se volvió a calcular el F1 macro. Este procedimiento rompe la relación entre las predicciones y las clases verdaderas, pero conserva la cantidad de observaciones y la distribución general de las etiquetas, permitiendo construir una distribución de referencia bajo el supuesto de que no existe una concordancia clínica real.</w:t>
+        <w:t>6.14. Diagnóstico del proceso generador de datos</w:t>
+      </w:r>
+    </w:p>
+    <w:p>
+      <w:r>
+        <w:t>El diagnóstico del proceso generador de datos integra la prueba de aleatorización, la curva de aprendizaje y el skill probabilístico. Para comprobar si el rendimiento obtenido por el modelo era realmente superior al azar, se realizó una prueba de aleatorización sobre el conjunto holdout. Las predicciones generadas por el pipeline se mantuvieron fijas y las etiquetas reales de los regímenes de quimioterapia se mezclaron aleatoriamente 5.000 veces. En cada repetición se volvió a calcular el F1 macro. Este procedimiento rompe la relación entre las predicciones y las clases verdaderas, pero conserva la cantidad de observaciones y la distribución general de las etiquetas, permitiendo construir una distribución de referencia bajo el supuesto de que no existe una concordancia clínica real.</w:t>
       </w:r>
     </w:p>
     <w:p>

</xml_diff>

<commit_message>
Finaliza auditoría reproducible y depura artefactos
</commit_message>
<xml_diff>
--- a/memoria/TFM_ENRIQUE_CATRILAF_ENTREGA_FINAL_VIU_2026.docx
+++ b/memoria/TFM_ENRIQUE_CATRILAF_ENTREGA_FINAL_VIU_2026.docx
@@ -36173,7 +36173,7 @@
         <w:spacing w:after="60"/>
       </w:pPr>
       <w:r>
-        <w:t>Publicación y trazabilidad en GitHub. El repositorio fue verificado como público y contiene el paquete reproducible del TFM: README.md, run_all.py, app.py, requirements.txt, src/, tests/, tools/, data/, outputs/, notebooks/, reports/, docs/, MODEL_CARD.md, METODOLOGIA_Y_JUSTIFICACION.md, QA_VERIFICACION.md y MANIFEST_SHA256.csv. run_all.py constituye el punto de entrada para reproducir el análisis completo y app.py ejecuta la aplicación web.</w:t>
+        <w:t>Publicación y trazabilidad en GitHub. El repositorio fue verificado como público y contiene el paquete reproducible del TFM: README.md, run_all.py, app.py, requirements.txt, src/, tests/, tools/, data/, outputs/, notebooks/, reports/, docs/, MODEL_CARD.md, QA_VERIFICACION.md y MANIFEST_SHA256.csv. run_all.py constituye el punto de entrada para reproducir el análisis completo y app.py ejecuta la aplicación web.</w:t>
       </w:r>
     </w:p>
     <w:p>
@@ -36316,7 +36316,7 @@
         </w:r>
       </w:hyperlink>
       <w:r>
-        <w:t>. La ejecución de extremo a extremo se inicia en run_all.py; la interfaz web se encuentra en app.py; y el núcleo analítico se organiza en src/, principalmente en config.py, preprocessing.py, data.py, modeling.py, metrics.py, robustness.py, clustering.py, figures.py, analysis.py y app_logic.py. Las pruebas automáticas se mantienen en tests/, las utilidades de reconstrucción y apoyo en tools/ y el notebook reproducible en notebooks/01_estudio_completo_oncologia.ipynb. README.md, requirements.txt, MODEL_CARD.md, METODOLOGIA_Y_JUSTIFICACION.md, QA_VERIFICACION.md, MANIFEST_SHA256.csv y docs/INDICE_AUDITORIA.md documentan dependencias, ejecución, validación y trazabilidad.</w:t>
+        <w:t>. La ejecución de extremo a extremo se inicia en run_all.py; la interfaz web se encuentra en app.py; y el núcleo analítico se organiza en src/, principalmente en config.py, preprocessing.py, data.py, modeling.py, metrics.py, robustness.py, clustering.py, figures.py, analysis.py y app_logic.py. Las pruebas automáticas se mantienen en tests/, las utilidades de reconstrucción y apoyo en tools/ y el notebook reproducible en notebooks/01_estudio_completo_oncologia.ipynb. README.md, requirements.txt, MODEL_CARD.md, QA_VERIFICACION.md, MANIFEST_SHA256.csv y docs/INDICE_AUDITORIA.md documentan dependencias, ejecución, validación y trazabilidad.</w:t>
       </w:r>
     </w:p>
     <w:p>

</xml_diff>